<commit_message>
docs(scoring): reconcile epsilon vs PLC-011 zone-distribution (v2.4, A.9)
</commit_message>
<xml_diff>
--- a/docs/reference/ACRME_Scoring_Weights_Explained.docx
+++ b/docs/reference/ACRME_Scoring_Weights_Explained.docx
@@ -2,7 +2,7 @@
 <file path=word/document.xml><?xml version="1.0" encoding="utf-8"?>
 <w:document xmlns:w="http://schemas.openxmlformats.org/wordprocessingml/2006/main" xmlns:m="http://schemas.openxmlformats.org/officeDocument/2006/math" xmlns:r="http://schemas.openxmlformats.org/officeDocument/2006/relationships" xmlns:o="urn:schemas-microsoft-com:office:office" xmlns:v="urn:schemas-microsoft-com:vml" xmlns:w10="urn:schemas-microsoft-com:office:word" xmlns:a="http://schemas.openxmlformats.org/drawingml/2006/main" xmlns:pic="http://schemas.openxmlformats.org/drawingml/2006/picture" xmlns:wp="http://schemas.openxmlformats.org/drawingml/2006/wordprocessingDrawing">
   <w:body>
-    <w:bookmarkStart w:id="40" w:name="Xb8e2825c0b26a481437e7003d1fa6640d37cf9c"/>
+    <w:bookmarkStart w:id="41" w:name="Xb8e2825c0b26a481437e7003d1fa6640d37cf9c"/>
     <w:p>
       <w:pPr>
         <w:pStyle w:val="Heading1"/>
@@ -58,7 +58,7 @@
         <w:t xml:space="preserve"> </w:t>
       </w:r>
       <w:r>
-        <w:t xml:space="preserve">1.0</w:t>
+        <w:t xml:space="preserve">1.1</w:t>
       </w:r>
       <w:r>
         <w:br/>
@@ -74,7 +74,7 @@
         <w:t xml:space="preserve"> </w:t>
       </w:r>
       <w:r>
-        <w:t xml:space="preserve">August 2026</w:t>
+        <w:t xml:space="preserve">August 2026 (reconciled to Requirements Baseline v2.4, 7 Sep 2026)</w:t>
       </w:r>
     </w:p>
     <w:p>
@@ -84,153 +84,152 @@
         </w:pict>
       </w:r>
     </w:p>
-    <w:bookmarkStart w:id="20" w:name="overview"/>
-    <w:p>
-      <w:pPr>
-        <w:pStyle w:val="Heading2"/>
-      </w:pPr>
-      <w:r>
-        <w:t xml:space="preserve">Overview</w:t>
-      </w:r>
-    </w:p>
-    <w:p>
-      <w:pPr>
-        <w:pStyle w:val="FirstParagraph"/>
-      </w:pPr>
-      <w:r>
-        <w:t xml:space="preserve">The ACRME placement engine uses</w:t>
-      </w:r>
-      <w:r>
-        <w:t xml:space="preserve"> </w:t>
-      </w:r>
-      <w:r>
-        <w:rPr>
-          <w:bCs/>
-          <w:b/>
-        </w:rPr>
-        <w:t xml:space="preserve">three environment-type-specific scoring formulas</w:t>
-      </w:r>
-      <w:r>
-        <w:t xml:space="preserve"> </w:t>
-      </w:r>
-      <w:r>
-        <w:t xml:space="preserve">(PS_Prod, PS_NonProd, PS_DR) to rank Azure regions for Prod, NonProd/CVAL, and DR environment placement. All three formulas share the same</w:t>
-      </w:r>
-      <w:r>
-        <w:t xml:space="preserve"> </w:t>
-      </w:r>
-      <w:r>
-        <w:rPr>
-          <w:bCs/>
-          <w:b/>
-        </w:rPr>
-        <w:t xml:space="preserve">default weight values</w:t>
-      </w:r>
-      <w:r>
-        <w:t xml:space="preserve">:</w:t>
-      </w:r>
-    </w:p>
-    <w:p>
-      <w:pPr>
-        <w:pStyle w:val="SourceCode"/>
-      </w:pPr>
-      <w:r>
-        <w:rPr>
-          <w:rStyle w:val="VerbatimChar"/>
-        </w:rPr>
-        <w:t xml:space="preserve">α = 0.30  (CRG Capacity)</w:t>
-      </w:r>
-      <w:r>
-        <w:br/>
-      </w:r>
-      <w:r>
-        <w:rPr>
-          <w:rStyle w:val="VerbatimChar"/>
-        </w:rPr>
-        <w:t xml:space="preserve">β = 0.20  (Quota Headroom)</w:t>
-      </w:r>
-      <w:r>
-        <w:br/>
-      </w:r>
-      <w:r>
-        <w:rPr>
-          <w:rStyle w:val="VerbatimChar"/>
-        </w:rPr>
-        <w:t xml:space="preserve">γ = 0.25  (Distribution Fairness)</w:t>
-      </w:r>
-      <w:r>
-        <w:br/>
-      </w:r>
-      <w:r>
-        <w:rPr>
-          <w:rStyle w:val="VerbatimChar"/>
-        </w:rPr>
-        <w:t xml:space="preserve">δ = 0.15  (DR/Overflow Health)</w:t>
-      </w:r>
-      <w:r>
-        <w:br/>
-      </w:r>
-      <w:r>
-        <w:rPr>
-          <w:rStyle w:val="VerbatimChar"/>
-        </w:rPr>
-        <w:t xml:space="preserve">ε = 0.10  (Zone Diversity)</w:t>
-      </w:r>
-    </w:p>
-    <w:p>
-      <w:pPr>
-        <w:pStyle w:val="FirstParagraph"/>
-      </w:pPr>
-      <w:r>
-        <w:t xml:space="preserve">However,</w:t>
-      </w:r>
-      <w:r>
-        <w:t xml:space="preserve"> </w:t>
-      </w:r>
-      <w:r>
-        <w:rPr>
-          <w:bCs/>
-          <w:b/>
-        </w:rPr>
-        <w:t xml:space="preserve">α</w:t>
-      </w:r>
-      <w:r>
-        <w:t xml:space="preserve"> </w:t>
-      </w:r>
-      <w:r>
-        <w:t xml:space="preserve">and</w:t>
-      </w:r>
-      <w:r>
-        <w:t xml:space="preserve"> </w:t>
-      </w:r>
-      <w:r>
-        <w:rPr>
-          <w:bCs/>
-          <w:b/>
-        </w:rPr>
-        <w:t xml:space="preserve">δ</w:t>
-      </w:r>
-      <w:r>
-        <w:t xml:space="preserve"> </w:t>
-      </w:r>
-      <w:r>
-        <w:t xml:space="preserve">have</w:t>
-      </w:r>
-      <w:r>
-        <w:t xml:space="preserve"> </w:t>
-      </w:r>
-      <w:r>
-        <w:rPr>
-          <w:bCs/>
-          <w:b/>
-        </w:rPr>
-        <w:t xml:space="preserve">different semantic meanings</w:t>
-      </w:r>
-      <w:r>
-        <w:t xml:space="preserve"> </w:t>
-      </w:r>
-      <w:r>
-        <w:t xml:space="preserve">per environment type — they measure different signals depending on whether you’re scoring a Prod, NonProd, or DR region.</w:t>
+    <w:p>
+      <w:pPr>
+        <w:pStyle w:val="BlockText"/>
+      </w:pPr>
+      <w:r>
+        <w:rPr>
+          <w:bCs/>
+          <w:b/>
+        </w:rPr>
+        <w:t xml:space="preserve">v2.4 reconciliation note (7 Sep 2026).</w:t>
+      </w:r>
+      <w:r>
+        <w:t xml:space="preserve"> </w:t>
+      </w:r>
+      <w:r>
+        <w:t xml:space="preserve">The five placement-scoring weights (α, β, γ, δ, ε) and their environment-specific formulas are</w:t>
+      </w:r>
+      <w:r>
+        <w:t xml:space="preserve"> </w:t>
+      </w:r>
+      <w:r>
+        <w:rPr>
+          <w:bCs/>
+          <w:b/>
+        </w:rPr>
+        <w:t xml:space="preserve">unchanged</w:t>
+      </w:r>
+      <w:r>
+        <w:t xml:space="preserve"> </w:t>
+      </w:r>
+      <w:r>
+        <w:t xml:space="preserve">by Baseline v2.4 — no weight value or formula is revised here. v2.4 clarifies one adjacency that this document must not conflate: the</w:t>
+      </w:r>
+      <w:r>
+        <w:t xml:space="preserve"> </w:t>
+      </w:r>
+      <w:r>
+        <w:rPr>
+          <w:bCs/>
+          <w:b/>
+        </w:rPr>
+        <w:t xml:space="preserve">ε zone-diversity signal</w:t>
+      </w:r>
+      <w:r>
+        <w:t xml:space="preserve"> </w:t>
+      </w:r>
+      <w:r>
+        <w:t xml:space="preserve">below (a region-selection weight,</w:t>
+      </w:r>
+      <w:r>
+        <w:t xml:space="preserve"> </w:t>
+      </w:r>
+      <w:r>
+        <w:rPr>
+          <w:rStyle w:val="VerbatimChar"/>
+        </w:rPr>
+        <w:t xml:space="preserve">az_count / 3</w:t>
+      </w:r>
+      <w:r>
+        <w:t xml:space="preserve">, PLC-007) is</w:t>
+      </w:r>
+      <w:r>
+        <w:t xml:space="preserve"> </w:t>
+      </w:r>
+      <w:r>
+        <w:rPr>
+          <w:bCs/>
+          <w:b/>
+        </w:rPr>
+        <w:t xml:space="preserve">distinct from PLC-011</w:t>
+      </w:r>
+      <w:r>
+        <w:t xml:space="preserve">, the new</w:t>
+      </w:r>
+      <w:r>
+        <w:t xml:space="preserve"> </w:t>
+      </w:r>
+      <w:r>
+        <w:rPr>
+          <w:bCs/>
+          <w:b/>
+        </w:rPr>
+        <w:t xml:space="preserve">even intra-region zone-distribution target</w:t>
+      </w:r>
+      <w:r>
+        <w:t xml:space="preserve"> </w:t>
+      </w:r>
+      <w:r>
+        <w:t xml:space="preserve">(</w:t>
+      </w:r>
+      <w:r>
+        <w:rPr>
+          <w:rStyle w:val="VerbatimChar"/>
+        </w:rPr>
+        <w:t xml:space="preserve">≈ 1 / zone_count</w:t>
+      </w:r>
+      <w:r>
+        <w:t xml:space="preserve"> </w:t>
+      </w:r>
+      <w:r>
+        <w:t xml:space="preserve">per zone) with rebalancing. ε</w:t>
+      </w:r>
+      <w:r>
+        <w:t xml:space="preserve"> </w:t>
+      </w:r>
+      <w:r>
+        <w:rPr>
+          <w:iCs/>
+          <w:i/>
+        </w:rPr>
+        <w:t xml:space="preserve">nudges region ranking</w:t>
+      </w:r>
+      <w:r>
+        <w:t xml:space="preserve"> </w:t>
+      </w:r>
+      <w:r>
+        <w:t xml:space="preserve">toward regions that have more zones;</w:t>
+      </w:r>
+      <w:r>
+        <w:t xml:space="preserve"> </w:t>
+      </w:r>
+      <w:r>
+        <w:rPr>
+          <w:bCs/>
+          <w:b/>
+        </w:rPr>
+        <w:t xml:space="preserve">PLC-011 governs how a workload’s VMs are spread across the zones of the region already chosen</w:t>
+      </w:r>
+      <w:r>
+        <w:t xml:space="preserve">, and can</w:t>
+      </w:r>
+      <w:r>
+        <w:t xml:space="preserve"> </w:t>
+      </w:r>
+      <w:r>
+        <w:rPr>
+          <w:iCs/>
+          <w:i/>
+        </w:rPr>
+        <w:t xml:space="preserve">trigger a rebalancing action</w:t>
+      </w:r>
+      <w:r>
+        <w:t xml:space="preserve"> </w:t>
+      </w:r>
+      <w:r>
+        <w:t xml:space="preserve">when zone skew exceeds the configured tolerance (C-13, formula Appendix A.9). See the ε section below for the full reconciliation. The remaining v2.4 additions (CAP-020..024, OPS-006) do not change any scoring formula.</w:t>
       </w:r>
     </w:p>
     <w:p>
@@ -240,8 +239,164 @@
         </w:pict>
       </w:r>
     </w:p>
+    <w:bookmarkStart w:id="20" w:name="overview"/>
+    <w:p>
+      <w:pPr>
+        <w:pStyle w:val="Heading2"/>
+      </w:pPr>
+      <w:r>
+        <w:t xml:space="preserve">Overview</w:t>
+      </w:r>
+    </w:p>
+    <w:p>
+      <w:pPr>
+        <w:pStyle w:val="FirstParagraph"/>
+      </w:pPr>
+      <w:r>
+        <w:t xml:space="preserve">The ACRME placement engine uses</w:t>
+      </w:r>
+      <w:r>
+        <w:t xml:space="preserve"> </w:t>
+      </w:r>
+      <w:r>
+        <w:rPr>
+          <w:bCs/>
+          <w:b/>
+        </w:rPr>
+        <w:t xml:space="preserve">three environment-type-specific scoring formulas</w:t>
+      </w:r>
+      <w:r>
+        <w:t xml:space="preserve"> </w:t>
+      </w:r>
+      <w:r>
+        <w:t xml:space="preserve">(PS_Prod, PS_NonProd, PS_DR) to rank Azure regions for Prod, NonProd/CVAL, and DR environment placement. All three formulas share the same</w:t>
+      </w:r>
+      <w:r>
+        <w:t xml:space="preserve"> </w:t>
+      </w:r>
+      <w:r>
+        <w:rPr>
+          <w:bCs/>
+          <w:b/>
+        </w:rPr>
+        <w:t xml:space="preserve">default weight values</w:t>
+      </w:r>
+      <w:r>
+        <w:t xml:space="preserve">:</w:t>
+      </w:r>
+    </w:p>
+    <w:p>
+      <w:pPr>
+        <w:pStyle w:val="SourceCode"/>
+      </w:pPr>
+      <w:r>
+        <w:rPr>
+          <w:rStyle w:val="VerbatimChar"/>
+        </w:rPr>
+        <w:t xml:space="preserve">α = 0.30  (CRG Capacity)</w:t>
+      </w:r>
+      <w:r>
+        <w:br/>
+      </w:r>
+      <w:r>
+        <w:rPr>
+          <w:rStyle w:val="VerbatimChar"/>
+        </w:rPr>
+        <w:t xml:space="preserve">β = 0.20  (Quota Headroom)</w:t>
+      </w:r>
+      <w:r>
+        <w:br/>
+      </w:r>
+      <w:r>
+        <w:rPr>
+          <w:rStyle w:val="VerbatimChar"/>
+        </w:rPr>
+        <w:t xml:space="preserve">γ = 0.25  (Distribution Fairness)</w:t>
+      </w:r>
+      <w:r>
+        <w:br/>
+      </w:r>
+      <w:r>
+        <w:rPr>
+          <w:rStyle w:val="VerbatimChar"/>
+        </w:rPr>
+        <w:t xml:space="preserve">δ = 0.15  (DR/Overflow Health)</w:t>
+      </w:r>
+      <w:r>
+        <w:br/>
+      </w:r>
+      <w:r>
+        <w:rPr>
+          <w:rStyle w:val="VerbatimChar"/>
+        </w:rPr>
+        <w:t xml:space="preserve">ε = 0.10  (Zone Diversity)</w:t>
+      </w:r>
+    </w:p>
+    <w:p>
+      <w:pPr>
+        <w:pStyle w:val="FirstParagraph"/>
+      </w:pPr>
+      <w:r>
+        <w:t xml:space="preserve">However,</w:t>
+      </w:r>
+      <w:r>
+        <w:t xml:space="preserve"> </w:t>
+      </w:r>
+      <w:r>
+        <w:rPr>
+          <w:bCs/>
+          <w:b/>
+        </w:rPr>
+        <w:t xml:space="preserve">α</w:t>
+      </w:r>
+      <w:r>
+        <w:t xml:space="preserve"> </w:t>
+      </w:r>
+      <w:r>
+        <w:t xml:space="preserve">and</w:t>
+      </w:r>
+      <w:r>
+        <w:t xml:space="preserve"> </w:t>
+      </w:r>
+      <w:r>
+        <w:rPr>
+          <w:bCs/>
+          <w:b/>
+        </w:rPr>
+        <w:t xml:space="preserve">δ</w:t>
+      </w:r>
+      <w:r>
+        <w:t xml:space="preserve"> </w:t>
+      </w:r>
+      <w:r>
+        <w:t xml:space="preserve">have</w:t>
+      </w:r>
+      <w:r>
+        <w:t xml:space="preserve"> </w:t>
+      </w:r>
+      <w:r>
+        <w:rPr>
+          <w:bCs/>
+          <w:b/>
+        </w:rPr>
+        <w:t xml:space="preserve">different semantic meanings</w:t>
+      </w:r>
+      <w:r>
+        <w:t xml:space="preserve"> </w:t>
+      </w:r>
+      <w:r>
+        <w:t xml:space="preserve">per environment type — they measure different signals depending on whether you’re scoring a Prod, NonProd, or DR region.</w:t>
+      </w:r>
+    </w:p>
+    <w:p>
+      <w:r>
+        <w:pict>
+          <v:rect style="width:0;height:1.5pt" o:hralign="center" o:hrstd="t" o:hr="t"/>
+        </w:pict>
+      </w:r>
+    </w:p>
     <w:bookmarkEnd w:id="20"/>
-    <w:bookmarkStart w:id="26" w:name="weight-definitions-by-component"/>
+    <w:bookmarkStart w:id="27" w:name="weight-definitions-by-component"/>
     <w:p>
       <w:pPr>
         <w:pStyle w:val="Heading2"/>
@@ -1614,7 +1769,7 @@
       </w:r>
     </w:p>
     <w:bookmarkEnd w:id="24"/>
-    <w:bookmarkStart w:id="25" w:name="ε-epsilon-zone-diversity-weight-0.10"/>
+    <w:bookmarkStart w:id="26" w:name="ε-epsilon-zone-diversity-weight-0.10"/>
     <w:p>
       <w:pPr>
         <w:pStyle w:val="Heading3"/>
@@ -1814,6 +1969,649 @@
         <w:t xml:space="preserve">already enforces a minimum zone count — ε acts as a tiebreaker that favors 3-zone regions when all else is equal. Increase ε toward 0.15 if zone diversity is a critical operational requirement; keep at 0.10 if capacity/distribution dominate.</w:t>
       </w:r>
     </w:p>
+    <w:bookmarkStart w:id="25" w:name="X5b9aa2c13ca65971fc940a728c2614ce4910cdb"/>
+    <w:p>
+      <w:pPr>
+        <w:pStyle w:val="Heading4"/>
+      </w:pPr>
+      <w:r>
+        <w:t xml:space="preserve">ε (region-selection) vs. PLC-011 (intra-region even distribution) — v2.4 reconciliation</w:t>
+      </w:r>
+    </w:p>
+    <w:p>
+      <w:pPr>
+        <w:pStyle w:val="FirstParagraph"/>
+      </w:pPr>
+      <w:r>
+        <w:t xml:space="preserve">ε and PLC-011 both concern availability zones but operate at</w:t>
+      </w:r>
+      <w:r>
+        <w:t xml:space="preserve"> </w:t>
+      </w:r>
+      <w:r>
+        <w:rPr>
+          <w:bCs/>
+          <w:b/>
+        </w:rPr>
+        <w:t xml:space="preserve">different stages</w:t>
+      </w:r>
+      <w:r>
+        <w:t xml:space="preserve"> </w:t>
+      </w:r>
+      <w:r>
+        <w:t xml:space="preserve">and must not be conflated:</w:t>
+      </w:r>
+    </w:p>
+    <w:tbl>
+      <w:tblPr>
+        <w:tblStyle w:val="Table"/>
+        <w:tblW w:type="pct" w:w="5000"/>
+        <w:tblLook w:firstRow="1" w:lastRow="0" w:firstColumn="0" w:lastColumn="0" w:noHBand="0" w:noVBand="0" w:val="0020"/>
+      </w:tblPr>
+      <w:tblGrid>
+        <w:gridCol w:w="2640"/>
+        <w:gridCol w:w="2640"/>
+        <w:gridCol w:w="2640"/>
+      </w:tblGrid>
+      <w:tr>
+        <w:trPr>
+          <w:tblHeader w:val="true"/>
+        </w:trPr>
+        <w:tc>
+          <w:tcPr/>
+          <w:p>
+            <w:pPr>
+              <w:pStyle w:val="Compact"/>
+              <w:jc w:val="left"/>
+            </w:pPr>
+            <w:r>
+              <w:t xml:space="preserve">Aspect</w:t>
+            </w:r>
+          </w:p>
+        </w:tc>
+        <w:tc>
+          <w:tcPr/>
+          <w:p>
+            <w:pPr>
+              <w:pStyle w:val="Compact"/>
+              <w:jc w:val="left"/>
+            </w:pPr>
+            <w:r>
+              <w:t xml:space="preserve">ε — Zone Diversity (this weight, PLC-007)</w:t>
+            </w:r>
+          </w:p>
+        </w:tc>
+        <w:tc>
+          <w:tcPr/>
+          <w:p>
+            <w:pPr>
+              <w:pStyle w:val="Compact"/>
+              <w:jc w:val="left"/>
+            </w:pPr>
+            <w:r>
+              <w:t xml:space="preserve">PLC-011 — Even Zone-Distribution Target</w:t>
+            </w:r>
+          </w:p>
+        </w:tc>
+      </w:tr>
+      <w:tr>
+        <w:tc>
+          <w:tcPr/>
+          <w:p>
+            <w:pPr>
+              <w:pStyle w:val="Compact"/>
+              <w:jc w:val="left"/>
+            </w:pPr>
+            <w:r>
+              <w:rPr>
+                <w:bCs/>
+                <w:b/>
+              </w:rPr>
+              <w:t xml:space="preserve">Stage</w:t>
+            </w:r>
+          </w:p>
+        </w:tc>
+        <w:tc>
+          <w:tcPr/>
+          <w:p>
+            <w:pPr>
+              <w:pStyle w:val="Compact"/>
+              <w:jc w:val="left"/>
+            </w:pPr>
+            <w:r>
+              <w:t xml:space="preserve">Region</w:t>
+            </w:r>
+            <w:r>
+              <w:t xml:space="preserve"> </w:t>
+            </w:r>
+            <w:r>
+              <w:rPr>
+                <w:bCs/>
+                <w:b/>
+              </w:rPr>
+              <w:t xml:space="preserve">selection</w:t>
+            </w:r>
+            <w:r>
+              <w:t xml:space="preserve"> </w:t>
+            </w:r>
+            <w:r>
+              <w:t xml:space="preserve">(which region wins)</w:t>
+            </w:r>
+          </w:p>
+        </w:tc>
+        <w:tc>
+          <w:tcPr/>
+          <w:p>
+            <w:pPr>
+              <w:pStyle w:val="Compact"/>
+              <w:jc w:val="left"/>
+            </w:pPr>
+            <w:r>
+              <w:t xml:space="preserve">Zone</w:t>
+            </w:r>
+            <w:r>
+              <w:t xml:space="preserve"> </w:t>
+            </w:r>
+            <w:r>
+              <w:rPr>
+                <w:bCs/>
+                <w:b/>
+              </w:rPr>
+              <w:t xml:space="preserve">placement within</w:t>
+            </w:r>
+            <w:r>
+              <w:t xml:space="preserve"> </w:t>
+            </w:r>
+            <w:r>
+              <w:t xml:space="preserve">the already-selected region</w:t>
+            </w:r>
+          </w:p>
+        </w:tc>
+      </w:tr>
+      <w:tr>
+        <w:tc>
+          <w:tcPr/>
+          <w:p>
+            <w:pPr>
+              <w:pStyle w:val="Compact"/>
+              <w:jc w:val="left"/>
+            </w:pPr>
+            <w:r>
+              <w:rPr>
+                <w:bCs/>
+                <w:b/>
+              </w:rPr>
+              <w:t xml:space="preserve">Signal / target</w:t>
+            </w:r>
+          </w:p>
+        </w:tc>
+        <w:tc>
+          <w:tcPr/>
+          <w:p>
+            <w:pPr>
+              <w:pStyle w:val="Compact"/>
+              <w:jc w:val="left"/>
+            </w:pPr>
+            <w:r>
+              <w:rPr>
+                <w:rStyle w:val="VerbatimChar"/>
+              </w:rPr>
+              <w:t xml:space="preserve">ε = az_count / 3</w:t>
+            </w:r>
+            <w:r>
+              <w:t xml:space="preserve"> </w:t>
+            </w:r>
+            <w:r>
+              <w:t xml:space="preserve">— a soft ranking</w:t>
+            </w:r>
+            <w:r>
+              <w:t xml:space="preserve"> </w:t>
+            </w:r>
+            <w:r>
+              <w:rPr>
+                <w:iCs/>
+                <w:i/>
+              </w:rPr>
+              <w:t xml:space="preserve">signal</w:t>
+            </w:r>
+          </w:p>
+        </w:tc>
+        <w:tc>
+          <w:tcPr/>
+          <w:p>
+            <w:pPr>
+              <w:pStyle w:val="Compact"/>
+              <w:jc w:val="left"/>
+            </w:pPr>
+            <w:r>
+              <w:t xml:space="preserve">Even spread ≈</w:t>
+            </w:r>
+            <w:r>
+              <w:t xml:space="preserve"> </w:t>
+            </w:r>
+            <w:r>
+              <w:rPr>
+                <w:rStyle w:val="VerbatimChar"/>
+              </w:rPr>
+              <w:t xml:space="preserve">1 / zone_count</w:t>
+            </w:r>
+            <w:r>
+              <w:t xml:space="preserve"> </w:t>
+            </w:r>
+            <w:r>
+              <w:t xml:space="preserve">per zone (≈33% each in a 3-zone region) — a placement</w:t>
+            </w:r>
+            <w:r>
+              <w:t xml:space="preserve"> </w:t>
+            </w:r>
+            <w:r>
+              <w:rPr>
+                <w:iCs/>
+                <w:i/>
+              </w:rPr>
+              <w:t xml:space="preserve">target</w:t>
+            </w:r>
+          </w:p>
+        </w:tc>
+      </w:tr>
+      <w:tr>
+        <w:tc>
+          <w:tcPr/>
+          <w:p>
+            <w:pPr>
+              <w:pStyle w:val="Compact"/>
+              <w:jc w:val="left"/>
+            </w:pPr>
+            <w:r>
+              <w:rPr>
+                <w:bCs/>
+                <w:b/>
+              </w:rPr>
+              <w:t xml:space="preserve">Effect</w:t>
+            </w:r>
+          </w:p>
+        </w:tc>
+        <w:tc>
+          <w:tcPr/>
+          <w:p>
+            <w:pPr>
+              <w:pStyle w:val="Compact"/>
+              <w:jc w:val="left"/>
+            </w:pPr>
+            <w:r>
+              <w:t xml:space="preserve">Nudges score toward regions that have more zones</w:t>
+            </w:r>
+          </w:p>
+        </w:tc>
+        <w:tc>
+          <w:tcPr/>
+          <w:p>
+            <w:pPr>
+              <w:pStyle w:val="Compact"/>
+              <w:jc w:val="left"/>
+            </w:pPr>
+            <w:r>
+              <w:t xml:space="preserve">(a) Prefers the</w:t>
+            </w:r>
+            <w:r>
+              <w:t xml:space="preserve"> </w:t>
+            </w:r>
+            <w:r>
+              <w:rPr>
+                <w:bCs/>
+                <w:b/>
+              </w:rPr>
+              <w:t xml:space="preserve">under-represented</w:t>
+            </w:r>
+            <w:r>
+              <w:t xml:space="preserve"> </w:t>
+            </w:r>
+            <w:r>
+              <w:t xml:space="preserve">zone for new placement; (b) raises a</w:t>
+            </w:r>
+            <w:r>
+              <w:t xml:space="preserve"> </w:t>
+            </w:r>
+            <w:r>
+              <w:rPr>
+                <w:bCs/>
+                <w:b/>
+              </w:rPr>
+              <w:t xml:space="preserve">rebalancing</w:t>
+            </w:r>
+            <w:r>
+              <w:t xml:space="preserve"> </w:t>
+            </w:r>
+            <w:r>
+              <w:t xml:space="preserve">recommendation/action when skew exceeds tolerance</w:t>
+            </w:r>
+          </w:p>
+        </w:tc>
+      </w:tr>
+      <w:tr>
+        <w:tc>
+          <w:tcPr/>
+          <w:p>
+            <w:pPr>
+              <w:pStyle w:val="Compact"/>
+              <w:jc w:val="left"/>
+            </w:pPr>
+            <w:r>
+              <w:rPr>
+                <w:bCs/>
+                <w:b/>
+              </w:rPr>
+              <w:t xml:space="preserve">Trigger</w:t>
+            </w:r>
+          </w:p>
+        </w:tc>
+        <w:tc>
+          <w:tcPr/>
+          <w:p>
+            <w:pPr>
+              <w:pStyle w:val="Compact"/>
+              <w:jc w:val="left"/>
+            </w:pPr>
+            <w:r>
+              <w:t xml:space="preserve">None — tiebreaker only</w:t>
+            </w:r>
+          </w:p>
+        </w:tc>
+        <w:tc>
+          <w:tcPr/>
+          <w:p>
+            <w:pPr>
+              <w:pStyle w:val="Compact"/>
+              <w:jc w:val="left"/>
+            </w:pPr>
+            <w:r>
+              <w:rPr>
+                <w:rStyle w:val="VerbatimChar"/>
+              </w:rPr>
+              <w:t xml:space="preserve">Max Skew &gt; Configured Skew Tolerance</w:t>
+            </w:r>
+            <w:r>
+              <w:t xml:space="preserve"> </w:t>
+            </w:r>
+            <w:r>
+              <w:t xml:space="preserve">(C-13) triggers rebalance (subject to approval + Azure feasibility)</w:t>
+            </w:r>
+          </w:p>
+        </w:tc>
+      </w:tr>
+      <w:tr>
+        <w:tc>
+          <w:tcPr/>
+          <w:p>
+            <w:pPr>
+              <w:pStyle w:val="Compact"/>
+              <w:jc w:val="left"/>
+            </w:pPr>
+            <w:r>
+              <w:rPr>
+                <w:bCs/>
+                <w:b/>
+              </w:rPr>
+              <w:t xml:space="preserve">Formula</w:t>
+            </w:r>
+          </w:p>
+        </w:tc>
+        <w:tc>
+          <w:tcPr/>
+          <w:p>
+            <w:pPr>
+              <w:pStyle w:val="Compact"/>
+              <w:jc w:val="left"/>
+            </w:pPr>
+            <w:r>
+              <w:rPr>
+                <w:rStyle w:val="VerbatimChar"/>
+              </w:rPr>
+              <w:t xml:space="preserve">az_count / 3</w:t>
+            </w:r>
+          </w:p>
+        </w:tc>
+        <w:tc>
+          <w:tcPr/>
+          <w:p>
+            <w:pPr>
+              <w:pStyle w:val="Compact"/>
+              <w:jc w:val="left"/>
+            </w:pPr>
+            <w:r>
+              <w:t xml:space="preserve">Appendix A.9 (below)</w:t>
+            </w:r>
+          </w:p>
+        </w:tc>
+      </w:tr>
+      <w:tr>
+        <w:tc>
+          <w:tcPr/>
+          <w:p>
+            <w:pPr>
+              <w:pStyle w:val="Compact"/>
+              <w:jc w:val="left"/>
+            </w:pPr>
+            <w:r>
+              <w:rPr>
+                <w:bCs/>
+                <w:b/>
+              </w:rPr>
+              <w:t xml:space="preserve">CRG interaction</w:t>
+            </w:r>
+          </w:p>
+        </w:tc>
+        <w:tc>
+          <w:tcPr/>
+          <w:p>
+            <w:pPr>
+              <w:pStyle w:val="Compact"/>
+              <w:jc w:val="left"/>
+            </w:pPr>
+            <w:r>
+              <w:t xml:space="preserve">—</w:t>
+            </w:r>
+          </w:p>
+        </w:tc>
+        <w:tc>
+          <w:tcPr/>
+          <w:p>
+            <w:pPr>
+              <w:pStyle w:val="Compact"/>
+              <w:jc w:val="left"/>
+            </w:pPr>
+            <w:r>
+              <w:t xml:space="preserve">Keeps per-AZ CRG sizing under</w:t>
+            </w:r>
+            <w:r>
+              <w:t xml:space="preserve"> </w:t>
+            </w:r>
+            <w:r>
+              <w:rPr>
+                <w:bCs/>
+                <w:b/>
+              </w:rPr>
+              <w:t xml:space="preserve">CAP-023</w:t>
+            </w:r>
+            <w:r>
+              <w:t xml:space="preserve"> </w:t>
+            </w:r>
+            <w:r>
+              <w:t xml:space="preserve">balanced</w:t>
+            </w:r>
+          </w:p>
+        </w:tc>
+      </w:tr>
+    </w:tbl>
+    <w:p>
+      <w:pPr>
+        <w:pStyle w:val="BodyText"/>
+      </w:pPr>
+      <w:r>
+        <w:t xml:space="preserve">The baseline is explicit that PLC-011</w:t>
+      </w:r>
+      <w:r>
+        <w:t xml:space="preserve"> </w:t>
+      </w:r>
+      <w:r>
+        <w:t xml:space="preserve">“</w:t>
+      </w:r>
+      <w:r>
+        <w:t xml:space="preserve">is a placement</w:t>
+      </w:r>
+      <w:r>
+        <w:t xml:space="preserve"> </w:t>
+      </w:r>
+      <w:r>
+        <w:rPr>
+          <w:bCs/>
+          <w:b/>
+        </w:rPr>
+        <w:t xml:space="preserve">target</w:t>
+      </w:r>
+      <w:r>
+        <w:t xml:space="preserve">, not merely the zone-diversity scoring</w:t>
+      </w:r>
+      <w:r>
+        <w:t xml:space="preserve"> </w:t>
+      </w:r>
+      <w:r>
+        <w:rPr>
+          <w:iCs/>
+          <w:i/>
+        </w:rPr>
+        <w:t xml:space="preserve">signal</w:t>
+      </w:r>
+      <w:r>
+        <w:t xml:space="preserve"> </w:t>
+      </w:r>
+      <w:r>
+        <w:t xml:space="preserve">used in PLC-007 weighting … without an explicit target the ε zone-diversity term only nudges scoring and cannot trigger a rebalance.</w:t>
+      </w:r>
+      <w:r>
+        <w:t xml:space="preserve">”</w:t>
+      </w:r>
+      <w:r>
+        <w:t xml:space="preserve"> </w:t>
+      </w:r>
+      <w:r>
+        <w:t xml:space="preserve">ε therefore remains purely a</w:t>
+      </w:r>
+      <w:r>
+        <w:t xml:space="preserve"> </w:t>
+      </w:r>
+      <w:r>
+        <w:rPr>
+          <w:bCs/>
+          <w:b/>
+        </w:rPr>
+        <w:t xml:space="preserve">region-ranking</w:t>
+      </w:r>
+      <w:r>
+        <w:t xml:space="preserve"> </w:t>
+      </w:r>
+      <w:r>
+        <w:t xml:space="preserve">tiebreaker; the intra-region distribution target and rebalancing are governed separately by PLC-011.</w:t>
+      </w:r>
+    </w:p>
+    <w:p>
+      <w:pPr>
+        <w:pStyle w:val="BodyText"/>
+      </w:pPr>
+      <w:r>
+        <w:rPr>
+          <w:bCs/>
+          <w:b/>
+        </w:rPr>
+        <w:t xml:space="preserve">Appendix A.9 — Even zone-distribution skew formula (PLC-011):</w:t>
+      </w:r>
+    </w:p>
+    <w:p>
+      <w:pPr>
+        <w:pStyle w:val="SourceCode"/>
+      </w:pPr>
+      <w:r>
+        <w:rPr>
+          <w:rStyle w:val="VerbatimChar"/>
+        </w:rPr>
+        <w:t xml:space="preserve">Even Zone Share            = 1 / Zone Count                       (e.g. 1/3 ≈ 33% in a 3-zone region)</w:t>
+      </w:r>
+      <w:r>
+        <w:br/>
+      </w:r>
+      <w:r>
+        <w:rPr>
+          <w:rStyle w:val="VerbatimChar"/>
+        </w:rPr>
+        <w:t xml:space="preserve">Target VMs per Zone        = round( Workload VM Count / Zone Count )</w:t>
+      </w:r>
+      <w:r>
+        <w:br/>
+      </w:r>
+      <w:r>
+        <w:rPr>
+          <w:rStyle w:val="VerbatimChar"/>
+        </w:rPr>
+        <w:t xml:space="preserve">Zone Skew(z)               = VMs in zone z - Target VMs per Zone</w:t>
+      </w:r>
+      <w:r>
+        <w:br/>
+      </w:r>
+      <w:r>
+        <w:rPr>
+          <w:rStyle w:val="VerbatimChar"/>
+        </w:rPr>
+        <w:t xml:space="preserve">Max Skew                   = MAX over zones z of | Zone Skew(z) |</w:t>
+      </w:r>
+      <w:r>
+        <w:br/>
+      </w:r>
+      <w:r>
+        <w:rPr>
+          <w:rStyle w:val="VerbatimChar"/>
+        </w:rPr>
+        <w:t xml:space="preserve">Rebalance Trigger          = Max Skew &gt; Configured Skew Tolerance  (C-13)</w:t>
+      </w:r>
+      <w:r>
+        <w:br/>
+      </w:r>
+      <w:r>
+        <w:rPr>
+          <w:rStyle w:val="VerbatimChar"/>
+        </w:rPr>
+        <w:t xml:space="preserve">Preferred Placement Zone   = argmin over zones z of ( VMs in zone z )   # under-represented zone</w:t>
+      </w:r>
+    </w:p>
+    <w:p>
+      <w:pPr>
+        <w:pStyle w:val="FirstParagraph"/>
+      </w:pPr>
+      <w:r>
+        <w:t xml:space="preserve">The target ratio and tolerance are configuration-driven (</w:t>
+      </w:r>
+      <w:r>
+        <w:rPr>
+          <w:rStyle w:val="VerbatimChar"/>
+        </w:rPr>
+        <w:t xml:space="preserve">PlacementPolicy</w:t>
+      </w:r>
+      <w:r>
+        <w:t xml:space="preserve">, constraint</w:t>
+      </w:r>
+      <w:r>
+        <w:t xml:space="preserve"> </w:t>
+      </w:r>
+      <w:r>
+        <w:rPr>
+          <w:bCs/>
+          <w:b/>
+        </w:rPr>
+        <w:t xml:space="preserve">C-13</w:t>
+      </w:r>
+      <w:r>
+        <w:t xml:space="preserve">). See the baseline PLC-011 and Appendix A.9, and ADR-003 (zone-distribution interaction) for the DR-sizing cross-reference.</w:t>
+      </w:r>
+    </w:p>
     <w:p>
       <w:r>
         <w:pict>
@@ -1823,7 +2621,8 @@
     </w:p>
     <w:bookmarkEnd w:id="25"/>
     <w:bookmarkEnd w:id="26"/>
-    <w:bookmarkStart w:id="30" w:name="complete-formula-definitions"/>
+    <w:bookmarkEnd w:id="27"/>
+    <w:bookmarkStart w:id="31" w:name="complete-formula-definitions"/>
     <w:p>
       <w:pPr>
         <w:pStyle w:val="Heading2"/>
@@ -1832,7 +2631,7 @@
         <w:t xml:space="preserve">Complete Formula Definitions</w:t>
       </w:r>
     </w:p>
-    <w:bookmarkStart w:id="27" w:name="ps_prodr-production-region-score"/>
+    <w:bookmarkStart w:id="28" w:name="ps_prodr-production-region-score"/>
     <w:p>
       <w:pPr>
         <w:pStyle w:val="Heading3"/>
@@ -1988,8 +2787,8 @@
         </w:pict>
       </w:r>
     </w:p>
-    <w:bookmarkEnd w:id="27"/>
-    <w:bookmarkStart w:id="28" w:name="X8da172e0e31a791c0e043e7d31bb4e3b549ce7f"/>
+    <w:bookmarkEnd w:id="28"/>
+    <w:bookmarkStart w:id="29" w:name="X8da172e0e31a791c0e043e7d31bb4e3b549ce7f"/>
     <w:p>
       <w:pPr>
         <w:pStyle w:val="Heading3"/>
@@ -2204,8 +3003,8 @@
         </w:pict>
       </w:r>
     </w:p>
-    <w:bookmarkEnd w:id="28"/>
-    <w:bookmarkStart w:id="29" w:name="ps_drr-disaster-recovery-region-score"/>
+    <w:bookmarkEnd w:id="29"/>
+    <w:bookmarkStart w:id="30" w:name="ps_drr-disaster-recovery-region-score"/>
     <w:p>
       <w:pPr>
         <w:pStyle w:val="Heading3"/>
@@ -2367,9 +3166,9 @@
         </w:pict>
       </w:r>
     </w:p>
-    <w:bookmarkEnd w:id="29"/>
     <w:bookmarkEnd w:id="30"/>
-    <w:bookmarkStart w:id="31" w:name="weight-summary-table"/>
+    <w:bookmarkEnd w:id="31"/>
+    <w:bookmarkStart w:id="32" w:name="weight-summary-table"/>
     <w:p>
       <w:pPr>
         <w:pStyle w:val="Heading2"/>
@@ -2916,8 +3715,8 @@
         </w:pict>
       </w:r>
     </w:p>
-    <w:bookmarkEnd w:id="31"/>
-    <w:bookmarkStart w:id="32" w:name="clamping-score-range"/>
+    <w:bookmarkEnd w:id="32"/>
+    <w:bookmarkStart w:id="33" w:name="clamping-score-range"/>
     <w:p>
       <w:pPr>
         <w:pStyle w:val="Heading2"/>
@@ -3007,8 +3806,8 @@
         </w:pict>
       </w:r>
     </w:p>
-    <w:bookmarkEnd w:id="32"/>
-    <w:bookmarkStart w:id="37" w:name="tuning-guidance"/>
+    <w:bookmarkEnd w:id="33"/>
+    <w:bookmarkStart w:id="38" w:name="tuning-guidance"/>
     <w:p>
       <w:pPr>
         <w:pStyle w:val="Heading2"/>
@@ -3017,7 +3816,7 @@
         <w:t xml:space="preserve">Tuning Guidance</w:t>
       </w:r>
     </w:p>
-    <w:bookmarkStart w:id="33" w:name="when-to-adjust-α-capacity"/>
+    <w:bookmarkStart w:id="34" w:name="when-to-adjust-α-capacity"/>
     <w:p>
       <w:pPr>
         <w:pStyle w:val="Heading3"/>
@@ -3070,8 +3869,8 @@
         <w:t xml:space="preserve">once regions reach steady-state utilization (40–60%) and distribution becomes the primary concern.</w:t>
       </w:r>
     </w:p>
-    <w:bookmarkEnd w:id="33"/>
-    <w:bookmarkStart w:id="34" w:name="when-to-adjust-γ-distribution"/>
+    <w:bookmarkEnd w:id="34"/>
+    <w:bookmarkStart w:id="35" w:name="when-to-adjust-γ-distribution"/>
     <w:p>
       <w:pPr>
         <w:pStyle w:val="Heading3"/>
@@ -3124,8 +3923,8 @@
         <w:t xml:space="preserve">if capacity constraints should dominate fairness (tight capacity environments).</w:t>
       </w:r>
     </w:p>
-    <w:bookmarkEnd w:id="34"/>
-    <w:bookmarkStart w:id="35" w:name="when-to-adjust-δ-droverflow-health"/>
+    <w:bookmarkEnd w:id="35"/>
+    <w:bookmarkStart w:id="36" w:name="when-to-adjust-δ-droverflow-health"/>
     <w:p>
       <w:pPr>
         <w:pStyle w:val="Heading3"/>
@@ -3178,8 +3977,8 @@
         <w:t xml:space="preserve">if capacity/distribution should dominate and DR health is consistently good.</w:t>
       </w:r>
     </w:p>
-    <w:bookmarkEnd w:id="35"/>
-    <w:bookmarkStart w:id="36" w:name="when-to-adjust-ε-zone-diversity"/>
+    <w:bookmarkEnd w:id="36"/>
+    <w:bookmarkStart w:id="37" w:name="when-to-adjust-ε-zone-diversity"/>
     <w:p>
       <w:pPr>
         <w:pStyle w:val="Heading3"/>
@@ -3281,9 +4080,9 @@
         </w:pict>
       </w:r>
     </w:p>
-    <w:bookmarkEnd w:id="36"/>
     <w:bookmarkEnd w:id="37"/>
-    <w:bookmarkStart w:id="38" w:name="source-references"/>
+    <w:bookmarkEnd w:id="38"/>
+    <w:bookmarkStart w:id="39" w:name="source-references"/>
     <w:p>
       <w:pPr>
         <w:pStyle w:val="Heading2"/>
@@ -3423,8 +4222,8 @@
         </w:pict>
       </w:r>
     </w:p>
-    <w:bookmarkEnd w:id="38"/>
-    <w:bookmarkStart w:id="39" w:name="evidence-tags"/>
+    <w:bookmarkEnd w:id="39"/>
+    <w:bookmarkStart w:id="40" w:name="evidence-tags"/>
     <w:p>
       <w:pPr>
         <w:pStyle w:val="Heading2"/>
@@ -3537,8 +4336,8 @@
         <w:t xml:space="preserve">After pilot Phase 4 (policy tuning with 30–50 placements measured)</w:t>
       </w:r>
     </w:p>
-    <w:bookmarkEnd w:id="39"/>
     <w:bookmarkEnd w:id="40"/>
+    <w:bookmarkEnd w:id="41"/>
     <w:sectPr/>
   </w:body>
 </w:document>

</xml_diff>